<commit_message>
Document Zalo client-side profile fetch flow and Render rewrite-rule fix
Update the deployment guide with the final working architecture for
Zalo login (server redirects with a signed token, browser fetches the
profile itself to bypass Zalo's Vietnam-IP restriction) and the real
incident where the Render SPA rewrite rule wasn't actually saved.
</commit_message>
<xml_diff>
--- a/Huong-dan-trien-khai-TechShop-len-Internet.docx
+++ b/Huong-dan-trien-khai-TechShop-len-Internet.docx
@@ -3093,7 +3093,343 @@
           <w:i/>
           <w:sz w:val="22"/>
         </w:rPr>
-        <w:t>Một số nền tảng (ví dụ Zalo) áp dụng thêm giới hạn theo vị trí địa lý của server gọi API: API lấy thông tin hồ sơ người dùng (graph.zalo.me) trả về lỗi "Personal information is limited due to IP address not inside Vietnam" khi được gọi từ server đặt ngoài Việt Nam (ví dụ datacenter Render tại Mỹ). Đây là giới hạn chính sách của nền tảng, không phải lỗi cấu hình hay logic code - toàn bộ luồng OAuth (ủy quyền, đổi mã lấy access token) vẫn hoạt động đúng chuẩn; chỉ riêng bước lấy hồ sơ cá nhân bị chặn theo IP. Cách khắc phục duy nhất là đặt server tại (hoặc dùng proxy đặt tại) đúng khu vực địa lý nền tảng yêu cầu.</w:t>
+        <w:t>Một số nền tảng (ví dụ Zalo) áp dụng thêm giới hạn theo vị trí địa lý của server gọi API: API lấy thông tin hồ sơ người dùng (graph.zalo.me) trả về lỗi "Personal information is limited due to IP address not inside Vietnam" khi được gọi từ server đặt ngoài Việt Nam (ví dụ datacenter Render tại Mỹ). Đây là giới hạn chính sách theo IP của nền tảng, không phải lỗi cấu hình hay logic code - toàn bộ luồng OAuth (ủy quyền, đổi mã lấy access token) vẫn hoạt động đúng chuẩn; chỉ riêng bước SERVER tự lấy hồ sơ cá nhân bị chặn theo IP. Mục 9.6 dưới đây trình bày giải pháp thực tế đã áp dụng cho dự án TechShop để vượt qua giới hạn này mà KHÔNG cần đổi vị trí hosting.</w:t>
+      </w:r>
+    </w:p>
+    <w:p>
+      <w:pPr>
+        <w:pStyle w:val="Heading2"/>
+      </w:pPr>
+      <w:r>
+        <w:t>9.6. Giải pháp áp dụng: lấy hồ sơ người dùng trực tiếp từ trình duyệt (client-side fetch)</w:t>
+      </w:r>
+    </w:p>
+    <w:p>
+      <w:pPr/>
+      <w:r>
+        <w:rPr>
+          <w:b w:val="0"/>
+          <w:i w:val="0"/>
+          <w:sz w:val="22"/>
+        </w:rPr>
+        <w:t>Nguyên nhân gốc của giới hạn ở Mục 9.5 là IP của SERVER (Render) không nằm ở Việt Nam - Zalo kiểm tra IP của bên GỌI API, không quan tâm IP của người dùng cuối. Vì vậy, nếu chuyển bước gọi API lấy hồ sơ (graph.zalo.me) từ phía Backend sang chạy trực tiếp trên trình duyệt của người dùng, request đó sẽ mang đúng IP thật của người dùng cuối (với người dùng Việt Nam, IP hầu như luôn nằm trong nước) - không còn bị chặn.</w:t>
+      </w:r>
+    </w:p>
+    <w:p>
+      <w:pPr/>
+      <w:r>
+        <w:rPr>
+          <w:b w:val="0"/>
+          <w:i w:val="0"/>
+          <w:sz w:val="22"/>
+        </w:rPr>
+        <w:t>Giải pháp này chỉ khả thi vì graph.zalo.me cho phép gọi trực tiếp bằng JavaScript từ trình duyệt (CORS mở), xác minh bằng lệnh curl mô phỏng một request có Origin của Frontend:</w:t>
+      </w:r>
+    </w:p>
+    <w:p>
+      <w:pPr>
+        <w:ind w:left="360"/>
+        <w:shd w:val="clear" w:fill="F2F2F2"/>
+      </w:pPr>
+      <w:r>
+        <w:rPr>
+          <w:rFonts w:ascii="Consolas" w:hAnsi="Consolas"/>
+          <w:sz w:val="19"/>
+        </w:rPr>
+        <w:t>curl -s -D - "https://graph.zalo.me/v2.0/me?fields=id,name,picture" \</w:t>
+        <w:br/>
+        <w:t xml:space="preserve">  -H "Origin: https://&lt;frontend&gt;.onrender.com" -H "access_token: &lt;token&gt;"</w:t>
+        <w:br/>
+        <w:br/>
+        <w:t># Phản hồi có các header CORS mở:</w:t>
+        <w:br/>
+        <w:t>access-control-allow-origin: *</w:t>
+        <w:br/>
+        <w:t>access-control-allow-headers: Origin, X-Requested-With, Content-Type, Accept, access_token, ...</w:t>
+      </w:r>
+    </w:p>
+    <w:p>
+      <w:pPr/>
+      <w:r>
+        <w:rPr>
+          <w:b w:val="0"/>
+          <w:i w:val="0"/>
+          <w:sz w:val="22"/>
+        </w:rPr>
+        <w:t>Luồng đăng nhập Zalo được thiết kế lại gồm 7 bước sau:</w:t>
+      </w:r>
+    </w:p>
+    <w:p>
+      <w:pPr>
+        <w:pStyle w:val="ListNumber"/>
+      </w:pPr>
+      <w:r>
+        <w:rPr>
+          <w:sz w:val="22"/>
+        </w:rPr>
+        <w:t>Frontend bấm "Đăng nhập bằng Zalo" → điều hướng cả trang sang Backend GET /api/auth/zalo/login.</w:t>
+      </w:r>
+    </w:p>
+    <w:p>
+      <w:pPr>
+        <w:pStyle w:val="ListNumber"/>
+      </w:pPr>
+      <w:r>
+        <w:rPr>
+          <w:sz w:val="22"/>
+        </w:rPr>
+        <w:t>Backend redirect sang Zalo (oauth.zaloapp.com/v4/permission) kèm code_challenge theo chuẩn PKCE.</w:t>
+      </w:r>
+    </w:p>
+    <w:p>
+      <w:pPr>
+        <w:pStyle w:val="ListNumber"/>
+      </w:pPr>
+      <w:r>
+        <w:rPr>
+          <w:sz w:val="22"/>
+        </w:rPr>
+        <w:t>Người dùng đăng nhập &amp; cấp quyền trên Zalo → Zalo redirect trình duyệt về đúng Callback URL đã đăng ký (Backend GET /api/auth/zalo/callback) kèm tham số code, state.</w:t>
+      </w:r>
+    </w:p>
+    <w:p>
+      <w:pPr>
+        <w:pStyle w:val="ListNumber"/>
+      </w:pPr>
+      <w:r>
+        <w:rPr>
+          <w:sz w:val="22"/>
+        </w:rPr>
+        <w:t>Backend đổi code lấy access_token qua oauth.zaloapp.com/v4/access_token. Bước này KHÔNG bị giới hạn IP vì chỉ trao đổi token, chưa truy vấn thông tin cá nhân.</w:t>
+      </w:r>
+    </w:p>
+    <w:p>
+      <w:pPr>
+        <w:pStyle w:val="ListNumber"/>
+      </w:pPr>
+      <w:r>
+        <w:rPr>
+          <w:sz w:val="22"/>
+        </w:rPr>
+        <w:t>Backend KHÔNG tự gọi graph.zalo.me nữa. Thay vào đó, Backend redirect trình duyệt sang một trang riêng ở Frontend, mang theo access_token qua URL fragment (phần sau dấu #): https://&lt;frontend&gt;/zalo-finish#access_token=... Vì phần sau dấu "#" không bao giờ được trình duyệt gửi lên bất kỳ server nào (kể cả khi tải trang Frontend), access_token không lọt vào access log của bất kỳ hệ thống nào.</w:t>
+      </w:r>
+    </w:p>
+    <w:p>
+      <w:pPr>
+        <w:pStyle w:val="ListNumber"/>
+      </w:pPr>
+      <w:r>
+        <w:rPr>
+          <w:sz w:val="22"/>
+        </w:rPr>
+        <w:t>Trang /zalo-finish (component React) đọc access_token từ URL, sau đó CHÍNH trình duyệt gọi thẳng GET https://graph.zalo.me/v2.0/me?fields=id,name,picture kèm header access_token - lúc này request mang IP thật của người dùng nên không bị chặn.</w:t>
+      </w:r>
+    </w:p>
+    <w:p>
+      <w:pPr>
+        <w:pStyle w:val="ListNumber"/>
+      </w:pPr>
+      <w:r>
+        <w:rPr>
+          <w:sz w:val="22"/>
+        </w:rPr>
+        <w:t>Trình duyệt POST kết quả hồ sơ (id, name, picture) về endpoint mới của Backend: POST /api/auth/zalo/complete. Backend tìm hoặc tạo User theo zaloId, set cookie refreshToken (httpOnly), trả về accessToken + thông tin user như một lần đăng nhập bình thường; Frontend lưu accessToken, cập nhật context và điều hướng vào trang chủ - hoàn tất, hiển thị đúng tên và ảnh đại diện Zalo thật.</w:t>
+      </w:r>
+    </w:p>
+    <w:p>
+      <w:pPr/>
+      <w:r>
+        <w:rPr>
+          <w:b w:val="0"/>
+          <w:i w:val="0"/>
+          <w:sz w:val="22"/>
+        </w:rPr>
+        <w:t>Phần khai báo lại route callback (Backend) - không gọi hồ sơ tại đây nữa:</w:t>
+      </w:r>
+    </w:p>
+    <w:p>
+      <w:pPr>
+        <w:ind w:left="360"/>
+        <w:shd w:val="clear" w:fill="F2F2F2"/>
+      </w:pPr>
+      <w:r>
+        <w:rPr>
+          <w:rFonts w:ascii="Consolas" w:hAnsi="Consolas"/>
+          <w:sz w:val="19"/>
+        </w:rPr>
+        <w:t>const tokenData = await exchangeCodeForToken({ appId, appSecret, code, codeVerifier: state });</w:t>
+        <w:br/>
+        <w:t>// Chuyển access_token cho trình duyệt qua URL fragment, KHÔNG gọi graph.zalo.me ở server</w:t>
+        <w:br/>
+        <w:t>res.redirect(`${clientUrl}/zalo-finish#access_token=${encodeURIComponent(tokenData.access_token)}`);</w:t>
+      </w:r>
+    </w:p>
+    <w:p>
+      <w:pPr/>
+      <w:r>
+        <w:rPr>
+          <w:b w:val="0"/>
+          <w:i w:val="0"/>
+          <w:sz w:val="22"/>
+        </w:rPr>
+        <w:t>Endpoint mới nhận hồ sơ do Frontend tự lấy và hoàn tất đăng nhập:</w:t>
+      </w:r>
+    </w:p>
+    <w:p>
+      <w:pPr>
+        <w:ind w:left="360"/>
+        <w:shd w:val="clear" w:fill="F2F2F2"/>
+      </w:pPr>
+      <w:r>
+        <w:rPr>
+          <w:rFonts w:ascii="Consolas" w:hAnsi="Consolas"/>
+          <w:sz w:val="19"/>
+        </w:rPr>
+        <w:t>router.post('/zalo/complete', asyncHandler(async (req, res) =&gt; {</w:t>
+        <w:br/>
+        <w:t xml:space="preserve">  const { id, name, picture } = req.body;</w:t>
+        <w:br/>
+        <w:t xml:space="preserve">  let user = await User.findOne({ zaloId: id });</w:t>
+        <w:br/>
+        <w:t xml:space="preserve">  if (!user) user = await User.create({ displayName: name, zaloId: id, avatar: picture?.data?.url, ... });</w:t>
+        <w:br/>
+        <w:t xml:space="preserve">  const accessToken = generateAccessToken({ _id: user._id, role: 'customer' });</w:t>
+        <w:br/>
+        <w:t xml:space="preserve">  res.cookie('refreshToken', generateRefreshToken(...), REFRESH_COOKIE_OPTIONS);</w:t>
+        <w:br/>
+        <w:t xml:space="preserve">  res.json({ user: user.toSafeObject(), accessToken });</w:t>
+        <w:br/>
+        <w:t>}));</w:t>
+      </w:r>
+    </w:p>
+    <w:p>
+      <w:pPr/>
+      <w:r>
+        <w:rPr>
+          <w:b w:val="0"/>
+          <w:i w:val="0"/>
+          <w:sz w:val="22"/>
+        </w:rPr>
+        <w:t>Trang Frontend tự gọi Zalo bằng IP thật của người dùng rồi bàn giao cho Backend:</w:t>
+      </w:r>
+    </w:p>
+    <w:p>
+      <w:pPr>
+        <w:ind w:left="360"/>
+        <w:shd w:val="clear" w:fill="F2F2F2"/>
+      </w:pPr>
+      <w:r>
+        <w:rPr>
+          <w:rFonts w:ascii="Consolas" w:hAnsi="Consolas"/>
+          <w:sz w:val="19"/>
+        </w:rPr>
+        <w:t>const accessToken = new URLSearchParams(window.location.hash.slice(1)).get('access_token');</w:t>
+        <w:br/>
+        <w:t>const res = await fetch(`https://graph.zalo.me/v2.0/me?fields=id,name,picture`,</w:t>
+        <w:br/>
+        <w:t xml:space="preserve">  { headers: { access_token: accessToken } });</w:t>
+        <w:br/>
+        <w:t>const profile = await res.json();</w:t>
+        <w:br/>
+        <w:t>const user = await authService.zaloComplete(profile); // POST /api/auth/zalo/complete</w:t>
+        <w:br/>
+        <w:t>setUser(user); navigate('/');</w:t>
+      </w:r>
+    </w:p>
+    <w:p>
+      <w:pPr>
+        <w:pStyle w:val="Heading2"/>
+      </w:pPr>
+      <w:r>
+        <w:t>9.7. Sự cố thực tế khi áp dụng: trang mới bị lỗi "Not Found" trên Static Site</w:t>
+      </w:r>
+    </w:p>
+    <w:p>
+      <w:pPr/>
+      <w:r>
+        <w:rPr>
+          <w:b w:val="0"/>
+          <w:i w:val="0"/>
+          <w:sz w:val="22"/>
+        </w:rPr>
+        <w:t>Sau khi thêm route /zalo-finish, bước Backend redirect trình duyệt sang trang này là một điều hướng CẢ TRANG (tương đương gõ hẳn URL mới, không phải điều hướng nội bộ của React Router). Lần đầu kiểm thử thực tế, thay vì hiển thị ứng dụng React, trình duyệt nhận về đúng một trang trắng ghi chữ "Not Found" - đây là trang lỗi mặc định của Render cho Static Site khi không có static file nào khớp với đường dẫn được yêu cầu.</w:t>
+      </w:r>
+    </w:p>
+    <w:p>
+      <w:pPr/>
+      <w:r>
+        <w:rPr>
+          <w:b w:val="0"/>
+          <w:i w:val="0"/>
+          <w:sz w:val="22"/>
+        </w:rPr>
+        <w:t>Nguyên nhân: quy tắc Rewrite "/* → /index.html" (đã nêu ở Mục 5.3) tưởng đã được lưu từ trước nhưng thực tế KHÔNG tồn tại trên dashboard Render. Vì bất kỳ điều hướng CẢ TRANG tới một đường dẫn con nào khác "/" (kể cả /login, /products, ...) đều cần rule này để Render trả về index.html cho React Router tự xử lý, việc thiếu rule ảnh hưởng đến MỌI route con của Frontend, không riêng /zalo-finish - chỉ là lỗi lộ rõ nhất ở bước OAuth vì đó là điều hướng cả trang duy nhất trong ứng dụng.</w:t>
+      </w:r>
+    </w:p>
+    <w:p>
+      <w:pPr/>
+      <w:r>
+        <w:rPr>
+          <w:b w:val="0"/>
+          <w:i w:val="0"/>
+          <w:sz w:val="22"/>
+        </w:rPr>
+        <w:t>Cách khắc phục và xác minh:</w:t>
+      </w:r>
+    </w:p>
+    <w:p>
+      <w:pPr>
+        <w:pStyle w:val="ListNumber"/>
+      </w:pPr>
+      <w:r>
+        <w:rPr>
+          <w:sz w:val="22"/>
+        </w:rPr>
+        <w:t>Vào Render Dashboard → chọn Static Site (Frontend) → tab "Redirects/Rewrites".</w:t>
+      </w:r>
+    </w:p>
+    <w:p>
+      <w:pPr>
+        <w:pStyle w:val="ListNumber"/>
+      </w:pPr>
+      <w:r>
+        <w:rPr>
+          <w:sz w:val="22"/>
+        </w:rPr>
+        <w:t>Thêm rule: Source "/*", Destination "/index.html", Action "Rewrite" (không chọn "Redirect" - Redirect sẽ đổi URL trên thanh địa chỉ, còn Rewrite giữ nguyên URL và chỉ đổi nội dung trả về).</w:t>
+      </w:r>
+    </w:p>
+    <w:p>
+      <w:pPr>
+        <w:pStyle w:val="ListNumber"/>
+      </w:pPr>
+      <w:r>
+        <w:rPr>
+          <w:sz w:val="22"/>
+        </w:rPr>
+        <w:t>Bấm "Save Changes". Nếu nút này đang hiển thị mờ/xám (disabled), hãy click lại vào ô Destination để form nhận diện có thay đổi cần lưu rồi bấm lại.</w:t>
+      </w:r>
+    </w:p>
+    <w:p>
+      <w:pPr>
+        <w:pStyle w:val="ListNumber"/>
+      </w:pPr>
+      <w:r>
+        <w:rPr>
+          <w:sz w:val="22"/>
+        </w:rPr>
+        <w:t>QUAN TRỌNG: tải lại (refresh) trang Redirects/Rewrites sau khi lưu để xác nhận rule vẫn còn - đây là bước kiểm tra bắt buộc vì giao diện đôi khi hiển thị rule đã nhập nhưng thực tế CHƯA được lưu vào hệ thống (đúng nguyên nhân xảy ra trong dự án này).</w:t>
+      </w:r>
+    </w:p>
+    <w:p>
+      <w:pPr>
+        <w:pStyle w:val="ListNumber"/>
+      </w:pPr>
+      <w:r>
+        <w:rPr>
+          <w:sz w:val="22"/>
+        </w:rPr>
+        <w:t>Thử lại luồng đăng nhập Zalo (hoặc gõ trực tiếp một route con bất kỳ, ví dụ .../login, vào thanh địa chỉ rồi Enter) để xác nhận không còn lỗi "Not Found".</w:t>
       </w:r>
     </w:p>
     <w:p>
@@ -3133,7 +3469,7 @@
         <w:pStyle w:val="ListBullet"/>
       </w:pPr>
       <w:r>
-        <w:t>☐ Frontend Render: Root Directory = frontend, VITE_API_URL đúng, đã thêm rewrite rule /* → /index.html</w:t>
+        <w:t>☐ Frontend Render: Root Directory = frontend, VITE_API_URL đúng, đã thêm rewrite rule /* → /index.html (đã refresh lại trang Redirects/Rewrites sau khi lưu để chắc chắn rule không bị mất)</w:t>
       </w:r>
     </w:p>
     <w:p>

</xml_diff>